<commit_message>
Fix SHAP inter-fold rank rho: 0.51 -> 0.33 (actual computed value)
The value rho=0.51 was incorrectly inserted in the previous revision.
The actual mean off-diagonal Spearman rank correlation from
results/robustness/shap/shap_fold_rank_correlation.csv (folds 9-12)
is rho=0.33. Updated in:
- README.md: R2 robustness table row
- paper/when_the_gate_stays_closed_FINAL.docx: 4 occurrences
  (abstract-area summary, results narrative, figure caption, table cell)

Interpretation unchanged: rho=0.33 remains classified as "moderate"
(threshold: <0.30 = low, 0.30-0.60 = moderate, >0.60 = high), still
confirming no single feature class consistently dominates across folds.
</commit_message>
<xml_diff>
--- a/paper/when_the_gate_stays_closed_FINAL.docx
+++ b/paper/when_the_gate_stays_closed_FINAL.docx
@@ -299,7 +299,7 @@
         <w:rPr>
           <w:rFonts w:ascii="Times New Roman" w:hAnsi="Times New Roman"/>
         </w:rPr>
-        <w:t>Five robustness checks leave the null result intact. Expanding the universe from 30 to 100 NASDAQ-100 stocks closes the gate again (p = 0.948). Diebold-Mariano tests confirm TopK1 is statistically indistinguishable from random stock selection (DM = 0.42, p = 0.672). The IC gate remains closed across all three VIX volatility terciles, ruling out a high-dispersion signal hypothesis. Block bootstrap confidence intervals span zero for all 12 folds. SHAP-based feature attribution (TreeExplainer, computed over both CatBoost and Random Forest components) shows moderate inter-fold rank stability (ρ = 0.51), with no feature class consistently dominating across folds — consistent with fitting fold-specific noise rather than a stable generalisable signal.</w:t>
+        <w:t>Five robustness checks leave the null result intact. Expanding the universe from 30 to 100 NASDAQ-100 stocks closes the gate again (p = 0.948). Diebold-Mariano tests confirm TopK1 is statistically indistinguishable from random stock selection (DM = 0.42, p = 0.672). The IC gate remains closed across all three VIX volatility terciles, ruling out a high-dispersion signal hypothesis. Block bootstrap confidence intervals span zero for all 12 folds. SHAP-based feature attribution (TreeExplainer, computed over both CatBoost and Random Forest components) shows moderate inter-fold rank stability (ρ = 0.33), with no feature class consistently dominating across folds — consistent with fitting fold-specific noise rather than a stable generalisable signal.</w:t>
       </w:r>
     </w:p>
     <w:p>
@@ -7666,7 +7666,7 @@
         <w:rPr>
           <w:rFonts w:ascii="Times New Roman" w:hAnsi="Times New Roman"/>
         </w:rPr>
-        <w:t>Feature rank stability across folds is the more informative diagnostic. Mean Spearman rank correlation of the top-feature orderings across folds 9–12 is ρ = 0.51 — moderate rather than high — indicating that while some features (MFI-14, MACD histogram, 63-day rolling volatility) maintain consistent importance, the ensemble has not converged to a stable predictive structure across folds. This moderate stability, in a context of near-zero IC, is consistent with the ensemble fitting fold-specific noise patterns rather than a generalisable signal. No single feature class (momentum, volatility, trend, volume) consistently dominates across tree-component SHAP attributions.</w:t>
+        <w:t>Feature rank stability across folds is the more informative diagnostic. Mean Spearman rank correlation of the top-feature orderings across folds 9–12 is ρ = 0.33 — moderate rather than high — indicating that while some features (MFI-14, MACD histogram, 63-day rolling volatility) maintain consistent importance, the ensemble has not converged to a stable predictive structure across folds. This moderate stability, in a context of near-zero IC, is consistent with the ensemble fitting fold-specific noise patterns rather than a generalisable signal. No single feature class (momentum, volatility, trend, volume) consistently dominates across tree-component SHAP attributions.</w:t>
       </w:r>
     </w:p>
     <w:p>
@@ -7732,7 +7732,7 @@
           <w:rFonts w:ascii="Times New Roman" w:hAnsi="Times New Roman"/>
           <w:sz w:val="19"/>
         </w:rPr>
-        <w:t xml:space="preserve"> Top-20 features by mean absolute tree-component SHAP value (CatBoost + Random Forest components, last 4 folds, TreeExplainer). Scores are uniformly small with no dominant feature. Mean inter-fold Spearman rank ρ = 0.51 (moderate) across tree-component SHAP attributions. Top features: MFI-14, MACD histogram, rolling 63-day volatility — all within a narrow noise-level band. MLP component excluded (requires kernel-based explainer).</w:t>
+        <w:t xml:space="preserve"> Top-20 features by mean absolute tree-component SHAP value (CatBoost + Random Forest components, last 4 folds, TreeExplainer). Scores are uniformly small with no dominant feature. Mean inter-fold Spearman rank ρ = 0.33 (moderate) across tree-component SHAP attributions. Top features: MFI-14, MACD histogram, rolling 63-day volatility — all within a narrow noise-level band. MLP component excluded (requires kernel-based explainer).</w:t>
       </w:r>
     </w:p>
     <w:p>
@@ -10535,7 +10535,7 @@
                 <w:rFonts w:ascii="Times New Roman" w:hAnsi="Times New Roman"/>
                 <w:sz w:val="19"/>
               </w:rPr>
-              <w:t>0.51 (moderate)</w:t>
+              <w:t>0.33 (moderate)</w:t>
             </w:r>
           </w:p>
         </w:tc>

</xml_diff>